<commit_message>
Raise lab guide rigor to ENCOR exam-topic objectives
</commit_message>
<xml_diff>
--- a/labs/01-802.1q-trunk/CCNP_ENCOR_802.1Q_Trunk_KB.docx
+++ b/labs/01-802.1q-trunk/CCNP_ENCOR_802.1Q_Trunk_KB.docx
@@ -88,6 +88,9 @@
         <w:gridCol w:w="10166"/>
       </w:tblGrid>
       <w:tr>
+        <w:trPr>
+          <w:cantSplit/>
+        </w:trPr>
         <w:tc>
           <w:tcPr>
             <w:tcW w:type="dxa" w:w="10166"/>
@@ -124,7 +127,7 @@
     </w:p>
     <w:p>
       <w:r>
-        <w:t>This lab targets ENCOR Infrastructure, Layer 2 troubleshooting of static and dynamic 802.1Q trunking. The learner will:</w:t>
+        <w:t>ENCOR 350-401 v1.2 alignment: 3.0 Infrastructure → 3.1 Layer 2 → 3.1.a, troubleshooting static and dynamic 802.1Q trunking. Static trunk configuration is the starting checkpoint. Required work also tests DTP negotiation, VLAN eligibility, forwarding evidence, and recovery from combined faults.</w:t>
       </w:r>
     </w:p>
     <w:p>
@@ -132,7 +135,7 @@
         <w:pStyle w:val="ListBullet"/>
       </w:pPr>
       <w:r>
-        <w:t>Explain how an 802.1Q trunk carries multiple VLANs across one physical link.</w:t>
+        <w:t>Predict static and dynamic trunk outcomes from both endpoints, then prove the operational state.</w:t>
       </w:r>
     </w:p>
     <w:p>
@@ -140,7 +143,7 @@
         <w:pStyle w:val="ListBullet"/>
       </w:pPr>
       <w:r>
-        <w:t>Configure a static trunk and disable DTP negotiation.</w:t>
+        <w:t>Implement the requested static trunk from requirements and explain each control.</w:t>
       </w:r>
     </w:p>
     <w:p>
@@ -148,7 +151,7 @@
         <w:pStyle w:val="ListBullet"/>
       </w:pPr>
       <w:r>
-        <w:t>Configure and validate the native VLAN and allowed VLAN list.</w:t>
+        <w:t>Distinguish allowed, allowed-and-active, and forwarding VLAN lists using evidence from both switches.</w:t>
       </w:r>
     </w:p>
     <w:p>
@@ -156,7 +159,7 @@
         <w:pStyle w:val="ListBullet"/>
       </w:pPr>
       <w:r>
-        <w:t>Correlate trunk state, VLAN activity, spanning-tree forwarding, MAC learning, and end-to-end reachability.</w:t>
+        <w:t>Prove VLAN 10, VLAN 20, and native VLAN 99 forwarding separately, including MAC learning.</w:t>
       </w:r>
     </w:p>
     <w:p>
@@ -164,7 +167,27 @@
         <w:pStyle w:val="ListBullet"/>
       </w:pPr>
       <w:r>
-        <w:t>Diagnose common failures such as access-mode links, native VLAN mismatches, and missing allowed VLANs.</w:t>
+        <w:t>Isolate multiple faults, repair only the affected configuration, and verify unaffected services.</w:t>
+      </w:r>
+    </w:p>
+    <w:p>
+      <w:pPr>
+        <w:pStyle w:val="Heading2"/>
+      </w:pPr>
+      <w:r>
+        <w:t>Independent practice and evidence</w:t>
+      </w:r>
+    </w:p>
+    <w:p>
+      <w:pPr/>
+      <w:r>
+        <w:t>Allow 75–90 minutes for the required work; this is a practice target, not a Cisco exam timing or scoring rule. Use the existing CML YAML and console access. Attempt the requirements before opening the reference solution. Keep a known-good configuration checkpoint before fault injection.</w:t>
+      </w:r>
+    </w:p>
+    <w:p>
+      <w:pPr/>
+      <w:r>
+        <w:t>For every incident, submit the symptom, two competing explanations, the command and exact field that separates them, the smallest correction, and before-and-after tests. A successful ping or a copied configuration alone does not meet the completion criteria.</w:t>
       </w:r>
     </w:p>
     <w:p>
@@ -191,6 +214,7 @@
       <w:tr>
         <w:trPr>
           <w:tblHeader w:val="true"/>
+          <w:cantSplit/>
         </w:trPr>
         <w:tc>
           <w:tcPr>
@@ -290,6 +314,9 @@
         </w:tc>
       </w:tr>
       <w:tr>
+        <w:trPr>
+          <w:cantSplit/>
+        </w:trPr>
         <w:tc>
           <w:tcPr>
             <w:tcW w:type="dxa" w:w="2541"/>
@@ -372,6 +399,9 @@
         </w:tc>
       </w:tr>
       <w:tr>
+        <w:trPr>
+          <w:cantSplit/>
+        </w:trPr>
         <w:tc>
           <w:tcPr>
             <w:tcW w:type="dxa" w:w="2541"/>
@@ -454,6 +484,9 @@
         </w:tc>
       </w:tr>
       <w:tr>
+        <w:trPr>
+          <w:cantSplit/>
+        </w:trPr>
         <w:tc>
           <w:tcPr>
             <w:tcW w:type="dxa" w:w="2541"/>
@@ -536,6 +569,9 @@
         </w:tc>
       </w:tr>
       <w:tr>
+        <w:trPr>
+          <w:cantSplit/>
+        </w:trPr>
         <w:tc>
           <w:tcPr>
             <w:tcW w:type="dxa" w:w="2541"/>
@@ -618,6 +654,9 @@
         </w:tc>
       </w:tr>
       <w:tr>
+        <w:trPr>
+          <w:cantSplit/>
+        </w:trPr>
         <w:tc>
           <w:tcPr>
             <w:tcW w:type="dxa" w:w="2541"/>
@@ -700,6 +739,9 @@
         </w:tc>
       </w:tr>
       <w:tr>
+        <w:trPr>
+          <w:cantSplit/>
+        </w:trPr>
         <w:tc>
           <w:tcPr>
             <w:tcW w:type="dxa" w:w="2541"/>
@@ -782,6 +824,9 @@
         </w:tc>
       </w:tr>
       <w:tr>
+        <w:trPr>
+          <w:cantSplit/>
+        </w:trPr>
         <w:tc>
           <w:tcPr>
             <w:tcW w:type="dxa" w:w="2541"/>
@@ -864,6 +909,9 @@
         </w:tc>
       </w:tr>
       <w:tr>
+        <w:trPr>
+          <w:cantSplit/>
+        </w:trPr>
         <w:tc>
           <w:tcPr>
             <w:tcW w:type="dxa" w:w="2541"/>
@@ -1032,7 +1080,7 @@
         <w:pStyle w:val="Heading1"/>
       </w:pPr>
       <w:r>
-        <w:t>5. Configure the 802.1Q Trunk</w:t>
+        <w:t>5. Independent Trunk Implementation</w:t>
       </w:r>
     </w:p>
     <w:p>
@@ -1040,73 +1088,7 @@
         <w:pStyle w:val="Heading2"/>
       </w:pPr>
       <w:r>
-        <w:t>SW1</w:t>
-      </w:r>
-    </w:p>
-    <w:p>
-      <w:pPr>
-        <w:pStyle w:val="CodeBlock"/>
-        <w:keepLines/>
-      </w:pPr>
-      <w:r>
-        <w:t>enable</w:t>
-        <w:br/>
-        <w:t>configure terminal</w:t>
-        <w:br/>
-        <w:t>interface gigabitEthernet 0/0</w:t>
-        <w:br/>
-        <w:t xml:space="preserve"> description 802.1Q TRUNK TO SW2 Gi0/0</w:t>
-        <w:br/>
-        <w:t xml:space="preserve"> switchport mode trunk</w:t>
-        <w:br/>
-        <w:t xml:space="preserve"> switchport trunk native vlan 99</w:t>
-        <w:br/>
-        <w:t xml:space="preserve"> switchport trunk allowed vlan 10,20,99</w:t>
-        <w:br/>
-        <w:t xml:space="preserve"> switchport nonegotiate</w:t>
-        <w:br/>
-        <w:t xml:space="preserve"> no shutdown</w:t>
-        <w:br/>
-        <w:t>end</w:t>
-        <w:br/>
-        <w:t>write memory</w:t>
-      </w:r>
-    </w:p>
-    <w:p>
-      <w:pPr>
-        <w:pStyle w:val="Heading2"/>
-      </w:pPr>
-      <w:r>
-        <w:t>SW2</w:t>
-      </w:r>
-    </w:p>
-    <w:p>
-      <w:pPr>
-        <w:pStyle w:val="CodeBlock"/>
-        <w:keepLines/>
-      </w:pPr>
-      <w:r>
-        <w:t>enable</w:t>
-        <w:br/>
-        <w:t>configure terminal</w:t>
-        <w:br/>
-        <w:t>interface gigabitEthernet 0/0</w:t>
-        <w:br/>
-        <w:t xml:space="preserve"> description 802.1Q TRUNK TO SW1 Gi0/0</w:t>
-        <w:br/>
-        <w:t xml:space="preserve"> switchport mode trunk</w:t>
-        <w:br/>
-        <w:t xml:space="preserve"> switchport trunk native vlan 99</w:t>
-        <w:br/>
-        <w:t xml:space="preserve"> switchport trunk allowed vlan 10,20,99</w:t>
-        <w:br/>
-        <w:t xml:space="preserve"> switchport nonegotiate</w:t>
-        <w:br/>
-        <w:t xml:space="preserve"> no shutdown</w:t>
-        <w:br/>
-        <w:t>end</w:t>
-        <w:br/>
-        <w:t>write memory</w:t>
+        <w:t>Required end state</w:t>
       </w:r>
     </w:p>
     <w:tbl>
@@ -1118,6 +1100,9 @@
         <w:gridCol w:w="10166"/>
       </w:tblGrid>
       <w:tr>
+        <w:trPr>
+          <w:cantSplit/>
+        </w:trPr>
         <w:tc>
           <w:tcPr>
             <w:tcW w:type="dxa" w:w="10166"/>
@@ -1140,6 +1125,18 @@
         </w:tc>
       </w:tr>
     </w:tbl>
+    <w:p>
+      <w:pPr/>
+      <w:r>
+        <w:t>Connect the two access switches while retaining VLAN 10 users, VLAN 20 server traffic, and VLAN 99 management. On both Gi0/0 interfaces, establish a static 802.1Q trunk with native VLAN 99, exactly VLANs 10,20,99 allowed, and DTP disabled. Preserve PC access ports, addresses and STP settings. Do not use an all-VLAN allow list or change the native VLAN to hide a mismatch.</w:t>
+      </w:r>
+    </w:p>
+    <w:p>
+      <w:pPr/>
+      <w:r>
+        <w:t>Write your intended commands and rollback first. Derive the configuration without the reference solution, then justify administrative mode, operational mode, negotiation state and per-VLAN forwarding on both ends. Save a working checkpoint only after section 7 passes.</w:t>
+      </w:r>
+    </w:p>
     <w:p>
       <w:pPr>
         <w:pStyle w:val="Heading1"/>
@@ -1273,7 +1270,7 @@
     </w:p>
     <w:p>
       <w:r>
-        <w:t>Gi0/0 normally does not appear as an access member in show vlan brief. Use show interfaces trunk to validate trunk VLAN membership. Confirm Gi0/0 is forwarding for the required VLANs.</w:t>
+        <w:t>A trunk is not normally listed as an access member in show vlan brief. Use show interfaces trunk to check VLAN eligibility, and STP output to prove forwarding for each required VLAN.</w:t>
       </w:r>
     </w:p>
     <w:p>
@@ -1378,7 +1375,7 @@
     </w:p>
     <w:p>
       <w:r>
-        <w:t>Successful VLAN 10 host tests demonstrate tagged VLAN 10 forwarding across the trunk. Successful VLAN 99 SVI tests demonstrate native VLAN connectivity between the switches.</w:t>
+        <w:t>These tests prove VLAN 10 host and VLAN 99 SVI reachability. They do not prove VLAN 20 forwarding. Complete the VLAN 20 exercise below before claiming that every required VLAN works.</w:t>
       </w:r>
     </w:p>
     <w:p>
@@ -1404,6 +1401,7 @@
       <w:tr>
         <w:trPr>
           <w:tblHeader w:val="true"/>
+          <w:cantSplit/>
         </w:trPr>
         <w:tc>
           <w:tcPr>
@@ -1479,6 +1477,9 @@
         </w:tc>
       </w:tr>
       <w:tr>
+        <w:trPr>
+          <w:cantSplit/>
+        </w:trPr>
         <w:tc>
           <w:tcPr>
             <w:tcW w:type="dxa" w:w="3389"/>
@@ -1541,6 +1542,9 @@
         </w:tc>
       </w:tr>
       <w:tr>
+        <w:trPr>
+          <w:cantSplit/>
+        </w:trPr>
         <w:tc>
           <w:tcPr>
             <w:tcW w:type="dxa" w:w="3389"/>
@@ -1603,6 +1607,9 @@
         </w:tc>
       </w:tr>
       <w:tr>
+        <w:trPr>
+          <w:cantSplit/>
+        </w:trPr>
         <w:tc>
           <w:tcPr>
             <w:tcW w:type="dxa" w:w="3389"/>
@@ -1665,6 +1672,9 @@
         </w:tc>
       </w:tr>
       <w:tr>
+        <w:trPr>
+          <w:cantSplit/>
+        </w:trPr>
         <w:tc>
           <w:tcPr>
             <w:tcW w:type="dxa" w:w="3389"/>
@@ -1727,6 +1737,9 @@
         </w:tc>
       </w:tr>
       <w:tr>
+        <w:trPr>
+          <w:cantSplit/>
+        </w:trPr>
         <w:tc>
           <w:tcPr>
             <w:tcW w:type="dxa" w:w="3389"/>
@@ -1789,6 +1802,9 @@
         </w:tc>
       </w:tr>
       <w:tr>
+        <w:trPr>
+          <w:cantSplit/>
+        </w:trPr>
         <w:tc>
           <w:tcPr>
             <w:tcW w:type="dxa" w:w="3389"/>
@@ -1851,6 +1867,9 @@
         </w:tc>
       </w:tr>
       <w:tr>
+        <w:trPr>
+          <w:cantSplit/>
+        </w:trPr>
         <w:tc>
           <w:tcPr>
             <w:tcW w:type="dxa" w:w="3389"/>
@@ -1918,12 +1937,12 @@
         <w:pStyle w:val="Heading1"/>
       </w:pPr>
       <w:r>
-        <w:t>9. Fault-Injection Practice</w:t>
+        <w:t>9. Required Trunk Fault Exercises</w:t>
       </w:r>
     </w:p>
     <w:p>
       <w:r>
-        <w:t>Apply one fault at a time, predict the impact, verify the failure, and restore the correct configuration.</w:t>
+        <w:t>Use a partner to inject the faults without naming them, or inject them yourself and close the setup commands before diagnosing. First perform each fault independently; then combine the VLAN 10 allow-list fault with the VLAN 20 database fault. Record predictions before collecting output.</w:t>
       </w:r>
     </w:p>
     <w:p>
@@ -1968,19 +1987,70 @@
     </w:p>
     <w:p>
       <w:pPr>
-        <w:pStyle w:val="CodeBlock"/>
-        <w:keepLines/>
+        <w:pStyle w:val="Heading2"/>
       </w:pPr>
       <w:r>
-        <w:t>interface gigabitEthernet 0/0</w:t>
-        <w:br/>
-        <w:t xml:space="preserve"> switchport mode trunk</w:t>
-        <w:br/>
-        <w:t xml:space="preserve"> switchport trunk native vlan 99</w:t>
-        <w:br/>
-        <w:t xml:space="preserve"> switchport trunk allowed vlan 10,20,99</w:t>
-        <w:br/>
-        <w:t xml:space="preserve"> switchport nonegotiate</w:t>
+        <w:t>9.1 Prove VLAN 20 forwarding</w:t>
+      </w:r>
+    </w:p>
+    <w:p>
+      <w:pPr/>
+      <w:r>
+        <w:t>After restoring all VLANs, temporarily move Gi0/1 on BOTH switches to access VLAN 20. Readdress PC1 eth0 as 10.20.20.11/24 and PC2 as 10.20.20.12/24. Save each host’s current address first; remove only its lab IPv4 address. Test in both directions, inspect VLAN 20 MAC learning, and confirm VLAN 99 management still works. Restore access VLAN 10 and the original PC addresses before continuing.</w:t>
+      </w:r>
+    </w:p>
+    <w:p>
+      <w:pPr>
+        <w:pStyle w:val="Heading2"/>
+      </w:pPr>
+      <w:r>
+        <w:t>9.2 Interpret a partial failure</w:t>
+      </w:r>
+    </w:p>
+    <w:p>
+      <w:pPr/>
+      <w:r>
+        <w:t>A switch shows allowed VLANs 10,20,99; allowed-and-active 10,99; forwarding and not pruned 10,99. Classify the missing VLAN 20 at the VLAN-database stage, not as proof of STP blocking. Now suppose active includes VLAN 20 but forwarding does not: identify the STP evidence needed before changing the allow list. In this two-switch topology there is no redundant Layer 2 path; explain why an unexpected blocked port deserves investigation.</w:t>
+      </w:r>
+    </w:p>
+    <w:p>
+      <w:pPr>
+        <w:pStyle w:val="Heading2"/>
+      </w:pPr>
+      <w:r>
+        <w:t>9.3 Test DTP negotiation</w:t>
+      </w:r>
+    </w:p>
+    <w:p>
+      <w:pPr/>
+      <w:r>
+        <w:t>Use only Gi0/0. Before entering dynamic modes, remove switchport nonegotiate on both ends. Hold VLAN existence, native VLAN and allow lists constant. Predict and test: auto/auto, desirable/auto, desirable/desirable, static trunk with negotiation/auto, and static trunk with nonegotiate/auto. Reset both ports to access between trials so an earlier negotiated state does not bias the result; then apply the next pair and allow negotiation to settle.</w:t>
+      </w:r>
+    </w:p>
+    <w:p>
+      <w:pPr/>
+      <w:r>
+        <w:t>Record administrative mode, operational mode, negotiation state and show interfaces trunk on BOTH switches. Explain why one endpoint can report trunk while its peer remains access. A matching native VLAN does not create a trunk. Restore static trunk plus nonegotiate on both ends after all trials.</w:t>
+      </w:r>
+    </w:p>
+    <w:p>
+      <w:pPr>
+        <w:pStyle w:val="Heading2"/>
+      </w:pPr>
+      <w:r>
+        <w:t>9.4 Diagnose the combined incident</w:t>
+      </w:r>
+    </w:p>
+    <w:p>
+      <w:pPr/>
+      <w:r>
+        <w:t>From the known-good state, have the injector remove VLAN 10 from SW2’s allowed list and delete VLAN 20 from SW1’s VLAN database. Management should still be tested independently. Repair one cause at a time, proving why restoring the VLAN 10 path does not resolve the VLAN 20 defect. Repeat VLAN 20 host tests, then restore host addressing and access VLAN 10.</w:t>
+      </w:r>
+    </w:p>
+    <w:p>
+      <w:pPr/>
+      <w:r>
+        <w:t>For the native-VLAN mismatch exercise, inspect logs and show spanning-tree inconsistentports as well as trunk output. PVST consistency checks may block affected VLANs; do not disable STP to make a ping work. Document the actual platform response rather than assuming every native mismatch produces the same symptom.</w:t>
       </w:r>
     </w:p>
     <w:p>
@@ -2092,6 +2162,187 @@
         <w:t>show ip interface brief</w:t>
         <w:br/>
         <w:t>ping 10.99.99.12 source vlan 99</w:t>
+      </w:r>
+    </w:p>
+    <w:p>
+      <w:pPr>
+        <w:pStyle w:val="Heading1"/>
+      </w:pPr>
+      <w:r>
+        <w:t>12. Independent Assessment</w:t>
+      </w:r>
+    </w:p>
+    <w:p>
+      <w:pPr/>
+      <w:r>
+        <w:t>Repeat the required tasks from the original YAML without the solution section. Self-assess each category: 0 = missing or incorrect, 1 = completed with hints or incomplete evidence, 2 = independent completion with correct explanation and evidence.</w:t>
+      </w:r>
+    </w:p>
+    <w:p>
+      <w:pPr>
+        <w:pStyle w:val="ListBullet"/>
+      </w:pPr>
+      <w:r>
+        <w:t>Implementation: exact VLAN policy, native VLAN match and DTP-disabled static operation.</w:t>
+      </w:r>
+    </w:p>
+    <w:p>
+      <w:pPr>
+        <w:pStyle w:val="ListBullet"/>
+      </w:pPr>
+      <w:r>
+        <w:t>Interpretation: explain all three VLAN lists and the five DTP test outcomes from both endpoints.</w:t>
+      </w:r>
+    </w:p>
+    <w:p>
+      <w:pPr>
+        <w:pStyle w:val="ListBullet"/>
+      </w:pPr>
+      <w:r>
+        <w:t>Diagnosis: isolate the combined incident and native mismatch with command evidence and minimal changes.</w:t>
+      </w:r>
+    </w:p>
+    <w:p>
+      <w:pPr>
+        <w:pStyle w:val="ListBullet"/>
+      </w:pPr>
+      <w:r>
+        <w:t>Acceptance: bidirectional VLAN 10 and temporary VLAN 20 tests, VLAN 99 management, correct MAC learning, and final restoration.</w:t>
+      </w:r>
+    </w:p>
+    <w:p>
+      <w:pPr/>
+      <w:r>
+        <w:t>Target 8/8 and all final-state checks satisfied. This rubric measures readiness for this lab’s objective; it is not an official Cisco score or a guarantee of exam performance. Record a corrective study action for each category below 2.</w:t>
+      </w:r>
+    </w:p>
+    <w:p>
+      <w:pPr>
+        <w:pStyle w:val="Heading1"/>
+      </w:pPr>
+      <w:r>
+        <w:t>13. Reference Solution and Reasoning</w:t>
+      </w:r>
+    </w:p>
+    <w:p>
+      <w:pPr/>
+      <w:r>
+        <w:t>Review after completing the independent attempt. Apply the original static solution to the named switch; create VLAN 20 again if it was removed during the fault exercise.</w:t>
+      </w:r>
+    </w:p>
+    <w:p>
+      <w:pPr>
+        <w:pStyle w:val="Heading2"/>
+      </w:pPr>
+      <w:r>
+        <w:t>SW1</w:t>
+      </w:r>
+    </w:p>
+    <w:p>
+      <w:pPr>
+        <w:pStyle w:val="CodeBlock"/>
+        <w:keepLines/>
+      </w:pPr>
+      <w:r>
+        <w:t>enable</w:t>
+        <w:br/>
+        <w:t>configure terminal</w:t>
+        <w:br/>
+        <w:t>interface gigabitEthernet 0/0</w:t>
+        <w:br/>
+        <w:t xml:space="preserve"> description 802.1Q TRUNK TO SW2 Gi0/0</w:t>
+        <w:br/>
+        <w:t xml:space="preserve"> switchport mode trunk</w:t>
+        <w:br/>
+        <w:t xml:space="preserve"> switchport trunk native vlan 99</w:t>
+        <w:br/>
+        <w:t xml:space="preserve"> switchport trunk allowed vlan 10,20,99</w:t>
+        <w:br/>
+        <w:t xml:space="preserve"> switchport nonegotiate</w:t>
+        <w:br/>
+        <w:t xml:space="preserve"> no shutdown</w:t>
+        <w:br/>
+        <w:t>end</w:t>
+        <w:br/>
+        <w:t>write memory</w:t>
+      </w:r>
+    </w:p>
+    <w:p>
+      <w:pPr>
+        <w:pStyle w:val="Heading2"/>
+      </w:pPr>
+      <w:r>
+        <w:t>SW2</w:t>
+      </w:r>
+    </w:p>
+    <w:p>
+      <w:pPr>
+        <w:pStyle w:val="CodeBlock"/>
+        <w:keepLines/>
+      </w:pPr>
+      <w:r>
+        <w:t>enable</w:t>
+        <w:br/>
+        <w:t>configure terminal</w:t>
+        <w:br/>
+        <w:t>interface gigabitEthernet 0/0</w:t>
+        <w:br/>
+        <w:t xml:space="preserve"> description 802.1Q TRUNK TO SW1 Gi0/0</w:t>
+        <w:br/>
+        <w:t xml:space="preserve"> switchport mode trunk</w:t>
+        <w:br/>
+        <w:t xml:space="preserve"> switchport trunk native vlan 99</w:t>
+        <w:br/>
+        <w:t xml:space="preserve"> switchport trunk allowed vlan 10,20,99</w:t>
+        <w:br/>
+        <w:t xml:space="preserve"> switchport nonegotiate</w:t>
+        <w:br/>
+        <w:t xml:space="preserve"> no shutdown</w:t>
+        <w:br/>
+        <w:t>end</w:t>
+        <w:br/>
+        <w:t>write memory</w:t>
+      </w:r>
+    </w:p>
+    <w:p>
+      <w:pPr/>
+      <w:r>
+        <w:t>DTP key: auto/auto stays access; desirable/auto and desirable/desirable negotiate trunk; static trunk with negotiation can bring an auto peer to trunk. Static trunk with nonegotiate stays trunk locally but cannot negotiate the auto peer into trunk. Validate the resulting mismatch on both ends.</w:t>
+      </w:r>
+    </w:p>
+    <w:p>
+      <w:pPr/>
+      <w:r>
+        <w:t>Combined-fault key: on SW2 Gi0/0, switchport trunk allowed vlan add 10 restores the missing permit without replacing other entries. On SW1, vlan 20 and name SERVERS restore VLAN existence. Neither repair substitutes for the other. Reapply the exact final allow list on both sides and verify the postconditions.</w:t>
+      </w:r>
+    </w:p>
+    <w:p>
+      <w:pPr>
+        <w:pStyle w:val="CodeBlock"/>
+        <w:keepLines/>
+      </w:pPr>
+      <w:r>
+        <w:t>! Both switches after temporary host tests</w:t>
+        <w:br/>
+        <w:t>interface GigabitEthernet0/1</w:t>
+        <w:br/>
+        <w:t xml:space="preserve"> switchport mode access</w:t>
+        <w:br/>
+        <w:t xml:space="preserve"> switchport access vlan 10</w:t>
+        <w:br/>
+        <w:t>! PC1: replace its temporary lab address</w:t>
+        <w:br/>
+        <w:t>! ip address del 10.20.20.11/24 dev eth0</w:t>
+        <w:br/>
+        <w:t>! ip address add 10.10.10.11/24 dev eth0</w:t>
+        <w:br/>
+        <w:t>! PC2: use .12 in both commands</w:t>
+      </w:r>
+    </w:p>
+    <w:p>
+      <w:pPr/>
+      <w:r>
+        <w:t>Exam blueprint: Cisco ENCOR 350-401 v1.2. Topic wording and scope: https://learningcontent.cisco.com/documents/marketing/exam-topics/350-401-ENCORE-v1.2.pdf</w:t>
       </w:r>
     </w:p>
     <w:p>

</xml_diff>